<commit_message>
Started HW2, updated assignment details, need to test & document code
</commit_message>
<xml_diff>
--- a/Week 2-Module 2/Homework 2/Assignment Details.docx
+++ b/Week 2-Module 2/Homework 2/Assignment Details.docx
@@ -1,188 +1,362 @@
 
 <file path=word/document.xml><?xml version="1.0" encoding="utf-8"?>
-<w:document xmlns:wpc="http://schemas.microsoft.com/office/word/2010/wordprocessingCanvas" xmlns:cx="http://schemas.microsoft.com/office/drawing/2014/chartex" xmlns:cx1="http://schemas.microsoft.com/office/drawing/2015/9/8/chartex" xmlns:cx2="http://schemas.microsoft.com/office/drawing/2015/10/21/chartex" xmlns:cx3="http://schemas.microsoft.com/office/drawing/2016/5/9/chartex" xmlns:cx4="http://schemas.microsoft.com/office/drawing/2016/5/10/chartex" xmlns:cx5="http://schemas.microsoft.com/office/drawing/2016/5/11/chartex" xmlns:cx6="http://schemas.microsoft.com/office/drawing/2016/5/12/chartex" xmlns:cx7="http://schemas.microsoft.com/office/drawing/2016/5/13/chartex" xmlns:cx8="http://schemas.microsoft.com/office/drawing/2016/5/14/chartex" xmlns:mc="http://schemas.openxmlformats.org/markup-compatibility/2006" xmlns:aink="http://schemas.microsoft.com/office/drawing/2016/ink" xmlns:am3d="http://schemas.microsoft.com/office/drawing/2017/model3d" xmlns:o="urn:schemas-microsoft-com:office:office" xmlns:oel="http://schemas.microsoft.com/office/2019/extlst" xmlns:r="http://schemas.openxmlformats.org/officeDocument/2006/relationships" xmlns:m="http://schemas.openxmlformats.org/officeDocument/2006/math" xmlns:v="urn:schemas-microsoft-com:vml" xmlns:wp14="http://schemas.microsoft.com/office/word/2010/wordprocessingDrawing" xmlns:wp="http://schemas.openxmlformats.org/drawingml/2006/wordprocessingDrawing" xmlns:w10="urn:schemas-microsoft-com:office:word" xmlns:w="http://schemas.openxmlformats.org/wordprocessingml/2006/main" xmlns:w14="http://schemas.microsoft.com/office/word/2010/wordml" xmlns:w15="http://schemas.microsoft.com/office/word/2012/wordml" xmlns:w16cex="http://schemas.microsoft.com/office/word/2018/wordml/cex" xmlns:w16cid="http://schemas.microsoft.com/office/word/2016/wordml/cid" xmlns:w16="http://schemas.microsoft.com/office/word/2018/wordml" xmlns:w16du="http://schemas.microsoft.com/office/word/2023/wordml/word16du" xmlns:w16sdtdh="http://schemas.microsoft.com/office/word/2020/wordml/sdtdatahash" xmlns:w16sdtfl="http://schemas.microsoft.com/office/word/2024/wordml/sdtformatlock" xmlns:w16se="http://schemas.microsoft.com/office/word/2015/wordml/symex" xmlns:wpg="http://schemas.microsoft.com/office/word/2010/wordprocessingGroup" xmlns:wpi="http://schemas.microsoft.com/office/word/2010/wordprocessingInk" xmlns:wne="http://schemas.microsoft.com/office/word/2006/wordml" xmlns:wps="http://schemas.microsoft.com/office/word/2010/wordprocessingShape" mc:Ignorable="w14 w15 w16se w16cid w16 w16cex w16sdtdh w16sdtfl w16du wp14">
+<w:document xmlns:wpc="http://schemas.microsoft.com/office/word/2010/wordprocessingCanvas" xmlns:mc="http://schemas.openxmlformats.org/markup-compatibility/2006" xmlns:o="urn:schemas-microsoft-com:office:office" xmlns:r="http://schemas.openxmlformats.org/officeDocument/2006/relationships" xmlns:m="http://schemas.openxmlformats.org/officeDocument/2006/math" xmlns:v="urn:schemas-microsoft-com:vml" xmlns:wp14="http://schemas.microsoft.com/office/word/2010/wordprocessingDrawing" xmlns:wp="http://schemas.openxmlformats.org/drawingml/2006/wordprocessingDrawing" xmlns:w10="urn:schemas-microsoft-com:office:word" xmlns:w="http://schemas.openxmlformats.org/wordprocessingml/2006/main" xmlns:w14="http://schemas.microsoft.com/office/word/2010/wordml" xmlns:w15="http://schemas.microsoft.com/office/word/2012/wordml" xmlns:w16se="http://schemas.microsoft.com/office/word/2015/wordml/symex" xmlns:w16cid="http://schemas.microsoft.com/office/word/2016/wordml/cid" xmlns:w16="http://schemas.microsoft.com/office/word/2018/wordml" xmlns:w16cex="http://schemas.microsoft.com/office/word/2018/wordml/cex" xmlns:w16sdtdh="http://schemas.microsoft.com/office/word/2020/wordml/sdtdatahash" xmlns:wne="http://schemas.microsoft.com/office/word/2006/wordml" xmlns:wpg="http://schemas.microsoft.com/office/word/2010/wordprocessingGroup" xmlns:wps="http://schemas.microsoft.com/office/word/2010/wordprocessingShape" mc:Ignorable="w14 w15 w16se w16cid w16 w16cex w16sdtdh wp14">
   <w:body>
     <w:p>
-      <w:r>
-        <w:t>In this lab, we will create a Java class that inputs an integer from the user and converts it to binary. For this, it will use an array.</w:t>
+      <w:pPr>
+        <w:spacing w:after="160" w:line="278" w:lineRule="auto"/>
+      </w:pPr>
+      <w:r>
+        <w:rPr>
+          <w:rFonts w:ascii="LatoWeb" w:cs="LatoWeb"/>
+          <w:sz w:val="24"/>
+          <w:szCs w:val="24"/>
+        </w:rPr>
+        <w:t xml:space="preserve">Please complete </w:t>
+      </w:r>
+      <w:hyperlink r:id="rId10" w:tooltip="Lab 2">
+        <w:r>
+          <w:rPr>
+            <w:rFonts w:ascii="LatoWeb" w:cs="LatoWeb"/>
+            <w:sz w:val="24"/>
+            <w:szCs w:val="24"/>
+            <w:u w:val="single"/>
+          </w:rPr>
+          <w:t>Lab 2</w:t>
+        </w:r>
+      </w:hyperlink>
+      <w:r>
+        <w:rPr>
+          <w:rFonts w:ascii="LatoWeb" w:cs="LatoWeb"/>
+          <w:sz w:val="24"/>
+          <w:szCs w:val="24"/>
+        </w:rPr>
+        <w:t xml:space="preserve"> before you start working on the homework. In this homework, you will continue the work on the project started in the lab and add some more functionality to it.</w:t>
       </w:r>
     </w:p>
     <w:p>
-      <w:r>
-        <w:rPr>
+      <w:pPr>
+        <w:pStyle w:val="Heading4"/>
+        <w:spacing w:before="90" w:after="90" w:line="360" w:lineRule="auto"/>
+        <w:jc w:val="left"/>
+        <w:outlineLvl w:val="3"/>
+      </w:pPr>
+      <w:r>
+        <w:rPr>
+          <w:rFonts w:ascii="Lato Extended" w:cs="Lato Extended"/>
           <w:b/>
           <w:bCs/>
-        </w:rPr>
-        <w:t>Ex. 1. a.</w:t>
-      </w:r>
-      <w:r>
-        <w:t> Declaring a Class.</w:t>
+          <w:sz w:val="27"/>
+          <w:szCs w:val="27"/>
+        </w:rPr>
+        <w:t>Ex. 1. List Container</w:t>
       </w:r>
     </w:p>
     <w:p>
-      <w:r>
-        <w:t>Open either Eclipse or NetBeans.</w:t>
+      <w:pPr>
+        <w:spacing w:before="180" w:after="180"/>
+        <w:jc w:val="left"/>
+      </w:pPr>
+      <w:r>
+        <w:rPr>
+          <w:rFonts w:ascii="LatoWeb" w:cs="LatoWeb"/>
+          <w:b/>
+          <w:bCs/>
+          <w:sz w:val="24"/>
+          <w:szCs w:val="24"/>
+        </w:rPr>
+        <w:t>a. List traversal.</w:t>
+      </w:r>
+      <w:r>
+        <w:rPr>
+          <w:rFonts w:ascii="LatoWeb" w:cs="LatoWeb"/>
+          <w:sz w:val="24"/>
+          <w:szCs w:val="24"/>
+        </w:rPr>
+        <w:t xml:space="preserve"> Add the following functions to the class List:</w:t>
       </w:r>
     </w:p>
     <w:p>
       <w:r>
         <w:rPr>
+          <w:rFonts w:ascii="LatoWeb" w:cs="LatoWeb"/>
+          <w:sz w:val="24"/>
+          <w:szCs w:val="24"/>
+        </w:rPr>
+        <w:t xml:space="preserve">A function </w:t>
+      </w:r>
+      <w:r>
+        <w:rPr>
+          <w:rFonts w:ascii="Monaco" w:cs="Monaco"/>
+          <w:sz w:val="24"/>
+          <w:szCs w:val="24"/>
+        </w:rPr>
+        <w:t xml:space="preserve">incrementAll </w:t>
+      </w:r>
+      <w:r>
+        <w:rPr>
+          <w:rFonts w:ascii="LatoWeb" w:cs="LatoWeb"/>
+          <w:sz w:val="24"/>
+          <w:szCs w:val="24"/>
+        </w:rPr>
+        <w:t>with no parameters that goes through all the nodes of the list and increments their value. This function is a simple traversal of the list, similar to the print, where the operation to do is output the datum in each node.</w:t>
+      </w:r>
+    </w:p>
+    <w:p>
+      <w:r>
+        <w:rPr>
+          <w:rFonts w:ascii="LatoWeb" w:cs="LatoWeb"/>
+          <w:sz w:val="24"/>
+          <w:szCs w:val="24"/>
+        </w:rPr>
+        <w:t xml:space="preserve">A function </w:t>
+      </w:r>
+      <w:r>
+        <w:rPr>
+          <w:rFonts w:ascii="Monaco" w:cs="Monaco"/>
+          <w:sz w:val="24"/>
+          <w:szCs w:val="24"/>
+        </w:rPr>
+        <w:t>Node find(int value)</w:t>
+      </w:r>
+      <w:r>
+        <w:rPr>
+          <w:rFonts w:ascii="LatoWeb" w:cs="LatoWeb"/>
+          <w:sz w:val="24"/>
+          <w:szCs w:val="24"/>
+        </w:rPr>
+        <w:t xml:space="preserve"> that takes one parameter and that looks through the list to find a node with the datum equal to the value of the parameter, and returns the first node it finds that contains the value, or null if the value is not in the list. This is also a simple traversal of the list.</w:t>
+      </w:r>
+    </w:p>
+    <w:p>
+      <w:r>
+        <w:rPr>
+          <w:rFonts w:ascii="LatoWeb" w:cs="LatoWeb"/>
+          <w:sz w:val="24"/>
+          <w:szCs w:val="24"/>
+        </w:rPr>
+        <w:t xml:space="preserve">A function </w:t>
+      </w:r>
+      <w:r>
+        <w:rPr>
+          <w:rFonts w:ascii="Monaco" w:cs="Monaco"/>
+          <w:sz w:val="24"/>
+          <w:szCs w:val="24"/>
+        </w:rPr>
+        <w:t>int countEven()</w:t>
+      </w:r>
+      <w:r>
+        <w:rPr>
+          <w:rFonts w:ascii="LatoWeb" w:cs="LatoWeb"/>
+          <w:sz w:val="24"/>
+          <w:szCs w:val="24"/>
+        </w:rPr>
+        <w:t xml:space="preserve"> that goes through the list and counts all the even numbers and returns this count at the end.</w:t>
+      </w:r>
+    </w:p>
+    <w:p>
+      <w:pPr>
+        <w:spacing w:before="180" w:after="180"/>
+        <w:jc w:val="left"/>
+      </w:pPr>
+      <w:r>
+        <w:rPr>
+          <w:rFonts w:ascii="LatoWeb" w:cs="LatoWeb"/>
+          <w:sz w:val="24"/>
+          <w:szCs w:val="24"/>
+        </w:rPr>
+        <w:t xml:space="preserve">Add three more options in the interface in the </w:t>
+      </w:r>
+      <w:r>
+        <w:rPr>
+          <w:rFonts w:ascii="Monaco" w:cs="Monaco"/>
+          <w:sz w:val="24"/>
+          <w:szCs w:val="24"/>
+        </w:rPr>
+        <w:t xml:space="preserve">main </w:t>
+      </w:r>
+      <w:r>
+        <w:rPr>
+          <w:rFonts w:ascii="LatoWeb" w:cs="LatoWeb"/>
+          <w:sz w:val="24"/>
+          <w:szCs w:val="24"/>
+        </w:rPr>
+        <w:t>where you test these new functions.</w:t>
+      </w:r>
+    </w:p>
+    <w:p>
+      <w:pPr>
+        <w:pStyle w:val="Heading4"/>
+        <w:spacing w:before="90" w:after="90" w:line="360" w:lineRule="auto"/>
+        <w:jc w:val="left"/>
+        <w:outlineLvl w:val="3"/>
+      </w:pPr>
+      <w:r>
+        <w:rPr>
+          <w:rFonts w:ascii="Lato Extended" w:cs="Lato Extended"/>
           <w:b/>
           <w:bCs/>
-        </w:rPr>
-        <w:t>Installing an IDE.</w:t>
-      </w:r>
-      <w:r>
-        <w:t> If you don't have either Eclipse or NetBeans installed on your computer, here are the links to download them:</w:t>
+          <w:sz w:val="27"/>
+          <w:szCs w:val="27"/>
+        </w:rPr>
+        <w:t>Ex. 2. Iterators</w:t>
       </w:r>
     </w:p>
     <w:p>
-      <w:r>
-        <w:t>Eclipse: </w:t>
-      </w:r>
-      <w:hyperlink r:id="rId4" w:history="1">
-        <w:r>
-          <w:rPr>
-            <w:rStyle w:val="Hyperlink"/>
-          </w:rPr>
-          <w:t>https://www.eclipse.org/downloads/</w:t>
-        </w:r>
-      </w:hyperlink>
+      <w:pPr>
+        <w:spacing w:before="180" w:after="180"/>
+        <w:jc w:val="left"/>
+      </w:pPr>
+      <w:r>
+        <w:rPr>
+          <w:rFonts w:ascii="LatoWeb" w:cs="LatoWeb"/>
+          <w:sz w:val="24"/>
+          <w:szCs w:val="24"/>
+        </w:rPr>
+        <w:t xml:space="preserve">In the class </w:t>
+      </w:r>
+      <w:r>
+        <w:rPr>
+          <w:rFonts w:ascii="Monaco" w:cs="Monaco"/>
+          <w:sz w:val="24"/>
+          <w:szCs w:val="24"/>
+        </w:rPr>
+        <w:t>ListIterator</w:t>
+      </w:r>
+      <w:r>
+        <w:rPr>
+          <w:rFonts w:ascii="LatoWeb" w:cs="LatoWeb"/>
+          <w:sz w:val="24"/>
+          <w:szCs w:val="24"/>
+        </w:rPr>
+        <w:t xml:space="preserve">, add a method called </w:t>
+      </w:r>
+      <w:r>
+        <w:rPr>
+          <w:rFonts w:ascii="Monaco" w:cs="Monaco"/>
+          <w:sz w:val="24"/>
+          <w:szCs w:val="24"/>
+        </w:rPr>
+        <w:t>set(int value)</w:t>
+      </w:r>
+      <w:r>
+        <w:rPr>
+          <w:rFonts w:ascii="LatoWeb" w:cs="LatoWeb"/>
+          <w:sz w:val="24"/>
+          <w:szCs w:val="24"/>
+        </w:rPr>
+        <w:t xml:space="preserve"> that assigns the value to the node current, if this node is not null.</w:t>
+      </w:r>
     </w:p>
     <w:p>
-      <w:r>
-        <w:t>NetBeans: </w:t>
-      </w:r>
-      <w:hyperlink r:id="rId5" w:history="1">
-        <w:r>
-          <w:rPr>
-            <w:rStyle w:val="Hyperlink"/>
-          </w:rPr>
-          <w:t>https://netbeans.apache.org/download/</w:t>
-        </w:r>
-      </w:hyperlink>
+      <w:pPr>
+        <w:spacing w:before="180" w:after="180"/>
+        <w:jc w:val="left"/>
+      </w:pPr>
+      <w:r>
+        <w:rPr>
+          <w:rFonts w:ascii="LatoWeb" w:cs="LatoWeb"/>
+          <w:sz w:val="24"/>
+          <w:szCs w:val="24"/>
+        </w:rPr>
+        <w:t xml:space="preserve">In the class List, add a method called </w:t>
+      </w:r>
+      <w:r>
+        <w:rPr>
+          <w:rFonts w:ascii="Monaco" w:cs="Monaco"/>
+          <w:sz w:val="24"/>
+          <w:szCs w:val="24"/>
+        </w:rPr>
+        <w:t>ListIterator end()</w:t>
+      </w:r>
+      <w:r>
+        <w:rPr>
+          <w:rFonts w:ascii="LatoWeb" w:cs="LatoWeb"/>
+          <w:sz w:val="24"/>
+          <w:szCs w:val="24"/>
+        </w:rPr>
+        <w:t xml:space="preserve"> that returns an iterator containing a reference to the last node in the list. Add another function in this class called decrease. This should be a traversal function using iterators that removes 1 from every node in the list.</w:t>
+      </w:r>
     </w:p>
     <w:p>
-      <w:r>
-        <w:t>Beside these IDEs, you may also have to update Java the latest version, and also install the Java SE Development kit:</w:t>
-      </w:r>
-      <w:r>
-        <w:br/>
-      </w:r>
-      <w:hyperlink r:id="rId6" w:history="1">
-        <w:r>
-          <w:rPr>
-            <w:rStyle w:val="Hyperlink"/>
-          </w:rPr>
-          <w:t>https://www.oracle.com/java/technologies/javase-downloads.html</w:t>
-        </w:r>
-      </w:hyperlink>
+      <w:pPr>
+        <w:spacing w:before="180" w:after="180"/>
+        <w:jc w:val="left"/>
+      </w:pPr>
+      <w:r>
+        <w:rPr>
+          <w:rFonts w:ascii="LatoWeb" w:cs="LatoWeb"/>
+          <w:sz w:val="24"/>
+          <w:szCs w:val="24"/>
+        </w:rPr>
+        <w:t xml:space="preserve">In the class </w:t>
+      </w:r>
+      <w:r>
+        <w:rPr>
+          <w:rFonts w:ascii="Monaco" w:cs="Monaco"/>
+          <w:sz w:val="24"/>
+          <w:szCs w:val="24"/>
+        </w:rPr>
+        <w:t>Main</w:t>
+      </w:r>
+      <w:r>
+        <w:rPr>
+          <w:rFonts w:ascii="LatoWeb" w:cs="LatoWeb"/>
+          <w:sz w:val="24"/>
+          <w:szCs w:val="24"/>
+        </w:rPr>
+        <w:t>, add a static function with a list as parameter, using iterators, that outputs the last element in the list. Note that this function doesn't need a loop.</w:t>
+      </w:r>
     </w:p>
     <w:p>
-      <w:r>
-        <w:rPr>
+      <w:pPr>
+        <w:spacing w:before="180" w:after="180"/>
+        <w:jc w:val="left"/>
+      </w:pPr>
+      <w:r>
+        <w:rPr>
+          <w:rFonts w:ascii="LatoWeb" w:cs="LatoWeb"/>
+          <w:sz w:val="24"/>
+          <w:szCs w:val="24"/>
+        </w:rPr>
+        <w:t>In the interface, add an option to test each of the new functions that were added.</w:t>
+      </w:r>
+    </w:p>
+    <w:p>
+      <w:pPr>
+        <w:pStyle w:val="Heading4"/>
+        <w:spacing w:before="90" w:after="90" w:line="360" w:lineRule="auto"/>
+        <w:jc w:val="left"/>
+        <w:outlineLvl w:val="3"/>
+      </w:pPr>
+      <w:r>
+        <w:rPr>
+          <w:rFonts w:ascii="Lato Extended" w:cs="Lato Extended"/>
           <w:b/>
           <w:bCs/>
-        </w:rPr>
-        <w:t>Creating a Project.</w:t>
-      </w:r>
-      <w:r>
-        <w:t> Create a project called Lab1. Inside this project, create a class called Converter containing the main function. Make sure that the class is in a package called lab1.</w:t>
+          <w:sz w:val="27"/>
+          <w:szCs w:val="27"/>
+        </w:rPr>
+        <w:t>Homework Submission</w:t>
       </w:r>
     </w:p>
     <w:p>
-      <w:r>
-        <w:rPr>
-          <w:b/>
-          <w:bCs/>
-        </w:rPr>
-        <w:t>b.</w:t>
-      </w:r>
-      <w:r>
-        <w:t> Class Attributes and Methods</w:t>
+      <w:pPr>
+        <w:spacing w:before="180" w:after="180"/>
+        <w:jc w:val="left"/>
+      </w:pPr>
+      <w:r>
+        <w:rPr>
+          <w:rFonts w:ascii="LatoWeb" w:cs="LatoWeb"/>
+          <w:sz w:val="24"/>
+          <w:szCs w:val="24"/>
+        </w:rPr>
+        <w:t>Include all the source code and screenshots of sample output in a single MS Word or PDF document and upload it here.</w:t>
       </w:r>
     </w:p>
-    <w:p>
-      <w:r>
-        <w:t>Add an attribute for the number in decimal notation, called decimal, and an array of 100 integer elements called binary. In addition, declare an integer attribute for the size of the binary array.</w:t>
-      </w:r>
-    </w:p>
-    <w:p>
-      <w:r>
-        <w:t>Declare a public constructor with no parameters (default constructor). Add a method that outputs the data in the class (all the attributes and the binary array in reverse).</w:t>
-      </w:r>
-    </w:p>
-    <w:p>
-      <w:r>
-        <w:rPr>
-          <w:b/>
-          <w:bCs/>
-        </w:rPr>
-        <w:t>c.</w:t>
-      </w:r>
-      <w:r>
-        <w:t> Conversion Method</w:t>
-      </w:r>
-    </w:p>
-    <w:p>
-      <w:r>
-        <w:t>Add a public method called convert with an integer parameter n. This method should store the number n in the decimal attribute, convert the number into binary using the binary array, and call the function to output the result.</w:t>
-      </w:r>
-    </w:p>
-    <w:p>
-      <w:r>
-        <w:t>For the conversion, use an index in the binary array starting from 0. First check if the number to convert is odd or even. If it's odd, store 1 in the binary array at the index, and if not, store a 0. Then increase the index and divide the number by 2. Repeat this until the number becomes 0. The last value of the index should be stored as the size of the binary array.</w:t>
-      </w:r>
-    </w:p>
-    <w:p>
-      <w:r>
-        <w:t xml:space="preserve">In the main, declare a Scanner object for easier input. For this, at the top of the file, inside the package but before the class, add a statement to import the module java.util.Scanner. </w:t>
-      </w:r>
-      <w:r>
-        <w:lastRenderedPageBreak/>
-        <w:t>Then add a variable called scan of type Scanner and initialize it with new Scanner(System.in).</w:t>
-      </w:r>
-    </w:p>
-    <w:p>
-      <w:r>
-        <w:t>Declare a variable of type converter and initialize it with a new object. Create a little interface menu with two options: 1 to convert a number to binary, and 2 to quit. For 1, ask the user to enter an integer number and convert it to binary and output the result. For 2, quit the program. Repeat this until the user enters 2. You can use a boolean variable quit to setup the interface loop.</w:t>
-      </w:r>
-    </w:p>
-    <w:p>
-      <w:r>
-        <w:t>This program will be continued in </w:t>
-      </w:r>
-      <w:hyperlink r:id="rId7" w:tooltip="Homework 1 A" w:history="1">
-        <w:r>
-          <w:rPr>
-            <w:rStyle w:val="Hyperlink"/>
-          </w:rPr>
-          <w:t>Homework 1</w:t>
-        </w:r>
-      </w:hyperlink>
-      <w:r>
-        <w:t>.</w:t>
-      </w:r>
-    </w:p>
-    <w:p>
-      <w:r>
-        <w:rPr>
-          <w:b/>
-          <w:bCs/>
-        </w:rPr>
-        <w:t>Lab Submission</w:t>
-      </w:r>
-    </w:p>
-    <w:p>
-      <w:r>
-        <w:t>Upload the file Converter.java and screenshots of some sample output.</w:t>
-      </w:r>
-    </w:p>
-    <w:p/>
     <w:sectPr>
       <w:pgSz w:w="12240" w:h="15840"/>
       <w:pgMar w:top="1440" w:right="1440" w:bottom="1440" w:left="1440" w:header="720" w:footer="720" w:gutter="0"/>
-      <w:cols w:space="720"/>
       <w:docGrid w:linePitch="360"/>
     </w:sectPr>
   </w:body>

</xml_diff>